<commit_message>
update page size of printLabelSaoHanTemplate.docx
</commit_message>
<xml_diff>
--- a/src/main/resources/printLabelSaoHanTemplate.docx
+++ b/src/main/resources/printLabelSaoHanTemplate.docx
@@ -18,8 +18,8 @@
       <w:bookmarkEnd w:id="0"/>
     </w:p>
     <w:sectPr>
-      <w:pgSz w:w="11282" w:h="20160"/>
-      <w:pgMar w:top="227" w:right="538" w:bottom="1440" w:left="386" w:header="720" w:footer="720" w:gutter="0"/>
+      <w:pgSz w:w="11055" w:h="19842"/>
+      <w:pgMar w:top="227" w:right="283" w:bottom="1440" w:left="386" w:header="720" w:footer="720" w:gutter="0"/>
       <w:paperSrc/>
       <w:cols w:space="0" w:num="1"/>
       <w:rtlGutter w:val="0"/>

</xml_diff>